<commit_message>
Add palette color-map modal with draggable window and saturation multiplier control
Adds a new "view palette color map" button/modal showing the current
palette as a near-square-packed grid of swatches (colorGridLayout.mjs),
plus a 0.0-3.0 saturate()-style multiplier slider (colorSaturation.mjs)
applied centrally in useColorPalette.mjs so it affects the 3D scene, 2D
resume view, and the modal itself. The modal is drag-to-move via the
existing usePointerDragOffset composable, matching Scene3DSettings.vue's
pattern. Also refreshes the locally parsed resume fixture data.

Co-authored-by: Cursor <cursoragent@cursor.com>
</commit_message>
<xml_diff>
--- a/parsed_resumes/shawn-becker-full-resume-indexed/SHAWN_BECKER_full_resume_indexed.docx
+++ b/parsed_resumes/shawn-becker-full-resume-indexed/SHAWN_BECKER_full_resume_indexed.docx
@@ -48,6 +48,7 @@
         <w:widowControl w:val="false"/>
         <w:spacing w:lineRule="auto" w:line="206" w:before="4" w:after="0"/>
         <w:ind w:hanging="6" w:start="5"/>
+        <w:jc w:val="center"/>
         <w:textAlignment w:val="baseline"/>
         <w:rPr>
           <w:i/>
@@ -63,7 +64,32 @@
           <w:sz w:val="22"/>
           <w:szCs w:val="22"/>
         </w:rPr>
-        <w:t>Senior Software Engineer &amp; Independent Consultant — AI/ML Engineering, Full-Stack Development &amp; Distributed Data Platforms</w:t>
+        <w:t>Senior Software Engineer &amp; Independent Consultant</w:t>
+      </w:r>
+    </w:p>
+    <w:p>
+      <w:pPr>
+        <w:pStyle w:val="Normal"/>
+        <w:widowControl w:val="false"/>
+        <w:spacing w:lineRule="auto" w:line="206" w:before="4" w:after="0"/>
+        <w:ind w:hanging="6" w:start="5"/>
+        <w:jc w:val="center"/>
+        <w:textAlignment w:val="baseline"/>
+        <w:rPr>
+          <w:i/>
+          <w:color w:val="000000"/>
+          <w:sz w:val="22"/>
+          <w:szCs w:val="22"/>
+        </w:rPr>
+      </w:pPr>
+      <w:r>
+        <w:rPr>
+          <w:i/>
+          <w:color w:val="000000"/>
+          <w:sz w:val="22"/>
+          <w:szCs w:val="22"/>
+        </w:rPr>
+        <w:t>AI/ML Engineering, Full-Stack Development &amp; Distributed Data Platforms</w:t>
       </w:r>
     </w:p>
     <w:p>
@@ -72,6 +98,7 @@
         <w:widowControl w:val="false"/>
         <w:spacing w:before="20" w:after="0"/>
         <w:ind w:start="1260"/>
+        <w:jc w:val="center"/>
         <w:textAlignment w:val="baseline"/>
         <w:rPr/>
       </w:pPr>
@@ -292,7 +319,7 @@
         <w:pStyle w:val="Normal"/>
         <w:widowControl w:val="false"/>
         <w:spacing w:lineRule="auto" w:line="125" w:before="1" w:after="0"/>
-        <w:jc w:val="both"/>
+        <w:jc w:val="center"/>
         <w:textAlignment w:val="baseline"/>
         <w:rPr>
           <w:rFonts w:ascii="Arial" w:hAnsi="Arial" w:eastAsia="Arial" w:cs="Arial"/>
@@ -382,6 +409,10 @@
       <w:pPr>
         <w:pStyle w:val="Normal"/>
         <w:widowControl w:val="false"/>
+        <w:tabs>
+          <w:tab w:val="clear" w:pos="720"/>
+          <w:tab w:val="left" w:pos="6490" w:leader="none"/>
+        </w:tabs>
         <w:spacing w:lineRule="auto" w:line="247" w:before="82" w:after="0"/>
         <w:textAlignment w:val="baseline"/>
         <w:rPr>
@@ -392,7 +423,7 @@
         <w:rPr>
           <w:color w:val="000000"/>
         </w:rPr>
-        <w:t>Senior individual-contributor engineer with 20+ years designing and delivering full-stack, AI/ML, and data-platform systems for Fortune 500 and regulated clients. Hands-on with Java/Spring Boot, Python/PySpark, AWS (EMR, Glue, SageMaker, Bedrock), and modern GenAI tooling (LangChain, LangGraph, Spring AI), building everything from event-driven data pipelines to agentic RAG systems. Co-invented 3 NLP patents in vector-embedding recommendation systems and led a semantic product ontology spanning 700K+ products as an early technical leader. Independent-consulting engagements run under Spexture (Independent Consulting), backed by ~2.75 years of sustained platform ownership at SeniorLink (now Careforth).</w:t>
+        <w:t>Senior Software, Full Stack &amp; Data Engineer + AI/ML with 30+ years building production systems across computer vision, NLP, and modern AI/ML architectures. MIT PhD focused on Computer Vision and Computer Graphics. Co-inventor of three patents for NLP-based recommendation systems using vector embeddings.</w:t>
       </w:r>
     </w:p>
     <w:p>
@@ -506,32 +537,44 @@
       </w:pPr>
       <w:r>
         <w:rPr/>
-        <w:t>[1] Spexture (Independent Consulting)</w:t>
-      </w:r>
-    </w:p>
-    <w:p>
-      <w:pPr>
-        <w:pStyle w:val="Normal"/>
-        <w:widowControl w:val="false"/>
-        <w:spacing w:lineRule="auto" w:line="206" w:before="4" w:after="0"/>
-        <w:ind w:hanging="6" w:start="5"/>
-        <w:textAlignment w:val="baseline"/>
-        <w:rPr>
-          <w:b/>
-          <w:color w:val="000000"/>
-          <w:sz w:val="21"/>
-          <w:szCs w:val="21"/>
-        </w:rPr>
-      </w:pPr>
-      <w:r>
-        <w:rPr>
-          <w:b/>
+        <w:t>[1] Spexture (Independent Consulting) (</w:t>
+      </w:r>
+      <w:r>
+        <w:rPr/>
+        <w:t>07</w:t>
+      </w:r>
+      <w:r>
+        <w:rPr>
+          <w:b w:val="false"/>
+          <w:bCs w:val="false"/>
           <w:color w:val="000000"/>
           <w:position w:val="1"/>
           <w:sz w:val="21"/>
           <w:szCs w:val="21"/>
         </w:rPr>
-        <w:t>11/2019 – Present</w:t>
+        <w:t>/20</w:t>
+      </w:r>
+      <w:r>
+        <w:rPr>
+          <w:b w:val="false"/>
+          <w:bCs w:val="false"/>
+          <w:color w:val="000000"/>
+          <w:position w:val="1"/>
+          <w:sz w:val="21"/>
+          <w:szCs w:val="21"/>
+        </w:rPr>
+        <w:t>25</w:t>
+      </w:r>
+      <w:r>
+        <w:rPr>
+          <w:b w:val="false"/>
+          <w:bCs w:val="false"/>
+          <w:color w:val="000000"/>
+          <w:position w:val="1"/>
+          <w:sz w:val="21"/>
+          <w:szCs w:val="21"/>
+        </w:rPr>
+        <w:t xml:space="preserve"> – Present)</w:t>
       </w:r>
     </w:p>
     <w:p>
@@ -629,15 +672,7 @@
       </w:pPr>
       <w:r>
         <w:rPr/>
-        <w:t xml:space="preserve">[1.1.1] • resume-parser </w:t>
-      </w:r>
-      <w:r>
-        <w:rPr/>
-        <w:t xml:space="preserve">(07/2024 – 03/2026) </w:t>
-      </w:r>
-      <w:r>
-        <w:rPr/>
-        <w:t>— Agentic DOCX/PDF → JSON résumé parser with manual approval gates (</w:t>
+        <w:t>[1.1.1] • resume-parser (07/2024 – 03/2026) — Agentic DOCX/PDF → JSON résumé parser with manual approval gates (</w:t>
       </w:r>
       <w:hyperlink r:id="rId7">
         <w:r>
@@ -663,15 +698,7 @@
       </w:pPr>
       <w:r>
         <w:rPr/>
-        <w:t xml:space="preserve">[1.1.2] • color-palette-maker </w:t>
-      </w:r>
-      <w:r>
-        <w:rPr/>
-        <w:t xml:space="preserve">(04/2025 – 05/2026) </w:t>
-      </w:r>
-      <w:r>
-        <w:rPr/>
-        <w:t>— React app generating color palettes via K-means clustering with CIEDE2000 perceptual color distance (</w:t>
+        <w:t>[1.1.2] • color-palette-maker (04/2025 – 05/2026) — React app generating color palettes via K-means clustering with CIEDE2000 perceptual color distance (</w:t>
       </w:r>
       <w:hyperlink r:id="rId8">
         <w:r>
@@ -697,15 +724,7 @@
       </w:pPr>
       <w:r>
         <w:rPr/>
-        <w:t xml:space="preserve">[1.1.3] • resume-flyer </w:t>
-      </w:r>
-      <w:r>
-        <w:rPr/>
-        <w:t xml:space="preserve">(07/2025 – 08/2026) </w:t>
-      </w:r>
-      <w:r>
-        <w:rPr/>
-        <w:t>— Vue 3 + TypeScript + Vite SPA with an Express.js backend that parses an uploaded résumé (via the resume-parser package) into an interactive jobs × skills 3D card explorer (</w:t>
+        <w:t>[1.1.3] • resume-flyer (07/2025 – 08/2026) — Vue 3 + TypeScript + Vite SPA with an Express.js backend that parses an uploaded résumé (via the resume-parser package) into an interactive jobs × skills 3D card explorer (</w:t>
       </w:r>
       <w:hyperlink r:id="rId9">
         <w:r>
@@ -731,15 +750,7 @@
       </w:pPr>
       <w:r>
         <w:rPr/>
-        <w:t xml:space="preserve">[1.1.4] • sushi-rag-mcp-server </w:t>
-      </w:r>
-      <w:r>
-        <w:rPr/>
-        <w:t xml:space="preserve">(10/2025 – 03/2026) </w:t>
-      </w:r>
-      <w:r>
-        <w:rPr/>
-        <w:t>— FastMCP + LangChain LCEL RAG server with ChromaDB, PostgreSQL, and a React frontend exposing 3 MCP tools (</w:t>
+        <w:t>[1.1.4] • sushi-rag-mcp-server (10/2025 – 03/2026) — FastMCP + LangChain LCEL RAG server with ChromaDB, PostgreSQL, and a React frontend exposing 3 MCP tools (</w:t>
       </w:r>
       <w:hyperlink r:id="rId10">
         <w:r>
@@ -791,15 +802,7 @@
       </w:pPr>
       <w:r>
         <w:rPr/>
-        <w:t xml:space="preserve">[1.1.6] • spexture-com </w:t>
-      </w:r>
-      <w:r>
-        <w:rPr/>
-        <w:t xml:space="preserve">(12/2025 – 07/2026) </w:t>
-      </w:r>
-      <w:r>
-        <w:rPr/>
-        <w:t>— React 18 + Express.js personal site with JWT/bcrypt auth, RBAC, and PostgreSQL; foundation layer complete, job-tracking feature layer still planned (</w:t>
+        <w:t>[1.1.6] • spexture-com (12/2025 – 07/2026) — React 18 + Express.js personal site with JWT/bcrypt auth, RBAC, and PostgreSQL; foundation layer complete, job-tracking feature layer still planned (</w:t>
       </w:r>
       <w:hyperlink r:id="rId12">
         <w:r>
@@ -825,15 +828,7 @@
       </w:pPr>
       <w:r>
         <w:rPr/>
-        <w:t xml:space="preserve">[1.1.7] • ecommerce-semantic-search </w:t>
-      </w:r>
-      <w:r>
-        <w:rPr/>
-        <w:t xml:space="preserve">(02/2026 – 07/2026) </w:t>
-      </w:r>
-      <w:r>
-        <w:rPr/>
-        <w:t>— Spring Boot + pgvector + HuggingFace MiniLM semantic search deployed on ECS Fargate (</w:t>
+        <w:t>[1.1.7] • ecommerce-semantic-search (02/2026 – 07/2026) — Spring Boot + pgvector + HuggingFace MiniLM semantic search deployed on ECS Fargate (</w:t>
       </w:r>
       <w:hyperlink r:id="rId13">
         <w:r>
@@ -859,15 +854,7 @@
       </w:pPr>
       <w:r>
         <w:rPr/>
-        <w:t xml:space="preserve">[1.1.8] • linkage-engine </w:t>
-      </w:r>
-      <w:r>
-        <w:rPr/>
-        <w:t xml:space="preserve">(03/2026 – 07/2026) </w:t>
-      </w:r>
-      <w:r>
-        <w:rPr/>
-        <w:t>— Java 21 / Spring Boot / Spring AI entity-resolution RAG service on Aurora PostgreSQL Serverless v2 + Bedrock; 149 tests, 94.5% instruction coverage (</w:t>
+        <w:t>[1.1.8] • linkage-engine (03/2026 – 07/2026) — Java 21 / Spring Boot / Spring AI entity-resolution RAG service on Aurora PostgreSQL Serverless v2 + Bedrock; 149 tests, 94.5% instruction coverage (</w:t>
       </w:r>
       <w:hyperlink r:id="rId14">
         <w:r>
@@ -893,15 +880,7 @@
       </w:pPr>
       <w:r>
         <w:rPr/>
-        <w:t xml:space="preserve">[1.1.9] • healthcare-agentic-snowflake-rag </w:t>
-      </w:r>
-      <w:r>
-        <w:rPr/>
-        <w:t xml:space="preserve">(06/2026 – 07/2026) </w:t>
-      </w:r>
-      <w:r>
-        <w:rPr/>
-        <w:t>— LangGraph corrective-RAG on Snowflake Cortex Search with MLflow, Optuna TPE HPO, and PSI drift monitoring (</w:t>
+        <w:t>[1.1.9] • healthcare-agentic-snowflake-rag (06/2026 – 07/2026) — LangGraph corrective-RAG on Snowflake Cortex Search with MLflow, Optuna TPE HPO, and PSI drift monitoring (</w:t>
       </w:r>
       <w:hyperlink r:id="rId15">
         <w:r>
@@ -927,15 +906,15 @@
       </w:pPr>
       <w:r>
         <w:rPr/>
-        <w:t xml:space="preserve">[1.1.10] • recruiting-automation </w:t>
-      </w:r>
-      <w:r>
-        <w:rPr/>
-        <w:t xml:space="preserve">(07/2026 – 08/2026) </w:t>
-      </w:r>
-      <w:r>
-        <w:rPr/>
-        <w:t>— launchd-scheduled pipeline orchestrating comms-migration inbox classification and job-tracker Gmail triage, LLM JD evaluation, and tailored résumé/cover-letter package generation (</w:t>
+        <w:t xml:space="preserve">[1.1.10] • recruiting-automation (07/2026 – </w:t>
+      </w:r>
+      <w:r>
+        <w:rPr/>
+        <w:t>Present</w:t>
+      </w:r>
+      <w:r>
+        <w:rPr/>
+        <w:t>) — launchd-scheduled pipeline orchestrating comms-migration inbox classification and job-tracker Gmail triage, LLM JD evaluation, and tailored résumé/cover-letter package generation (</w:t>
       </w:r>
       <w:hyperlink r:id="rId16">
         <w:r>
@@ -1087,7 +1066,14 @@
       </w:pPr>
       <w:r>
         <w:rPr/>
-        <w:t>[1.2.7] • NuSkin (11/2019 – 11/2020) — Built registration, login, and profile pages using Vue 3 and Node.js with Vuetify (UI) and Vuelidate (form validation), in Jira-tracked Agile sprints.</w:t>
+        <w:t>[1.2.7] • NuSkin (11</w:t>
+      </w:r>
+      <w:r>
+        <w:rPr>
+          <w:b w:val="false"/>
+          <w:bCs w:val="false"/>
+        </w:rPr>
+        <w:t>/2019 – 11/2020) — Built registration, login, and profile pages using Vue 3 and Node.js with Vuetify (UI) and Vuelidate (form validation), in Jira-tracked Agile sprints.</w:t>
       </w:r>
     </w:p>
     <w:p>
@@ -1103,40 +1089,37 @@
         <w:textAlignment w:val="baseline"/>
         <w:outlineLvl w:val="3"/>
         <w:rPr>
-          <w:b/>
+          <w:b w:val="false"/>
+          <w:bCs w:val="false"/>
+        </w:rPr>
+      </w:pPr>
+      <w:r>
+        <w:rPr>
+          <w:b w:val="false"/>
+          <w:bCs w:val="false"/>
+        </w:rPr>
+        <w:t>[2] SeniorLink (now Careforth)</w:t>
+      </w:r>
+      <w:r>
+        <w:rPr>
+          <w:b w:val="false"/>
+          <w:bCs w:val="false"/>
           <w:color w:val="000000"/>
           <w:sz w:val="21"/>
           <w:szCs w:val="21"/>
         </w:rPr>
-      </w:pPr>
-      <w:r>
-        <w:rPr/>
-        <w:t>[2] SeniorLink (now Careforth)</w:t>
-      </w:r>
-    </w:p>
-    <w:p>
-      <w:pPr>
-        <w:pStyle w:val="Normal"/>
-        <w:widowControl w:val="false"/>
-        <w:spacing w:lineRule="auto" w:line="206" w:before="4" w:after="0"/>
-        <w:ind w:hanging="6" w:start="5"/>
-        <w:textAlignment w:val="baseline"/>
-        <w:rPr>
-          <w:b/>
-          <w:color w:val="000000"/>
-          <w:sz w:val="21"/>
-          <w:szCs w:val="21"/>
-        </w:rPr>
-      </w:pPr>
-      <w:r>
-        <w:rPr>
-          <w:b/>
+        <w:t xml:space="preserve"> (</w:t>
+      </w:r>
+      <w:r>
+        <w:rPr>
+          <w:b w:val="false"/>
+          <w:bCs w:val="false"/>
           <w:color w:val="000000"/>
           <w:position w:val="1"/>
           <w:sz w:val="21"/>
           <w:szCs w:val="21"/>
         </w:rPr>
-        <w:t>02/2017 – 11/2019</w:t>
+        <w:t>02/2017 – 11/2019)</w:t>
       </w:r>
     </w:p>
     <w:p>
@@ -1147,19 +1130,19 @@
         <w:ind w:hanging="6" w:start="5"/>
         <w:textAlignment w:val="baseline"/>
         <w:rPr>
+          <w:b w:val="false"/>
+          <w:bCs w:val="false"/>
+        </w:rPr>
+      </w:pPr>
+      <w:r>
+        <w:rPr>
+          <w:b w:val="false"/>
+          <w:bCs w:val="false"/>
           <w:i/>
           <w:color w:val="000000"/>
           <w:sz w:val="22"/>
           <w:szCs w:val="22"/>
         </w:rPr>
-      </w:pPr>
-      <w:r>
-        <w:rPr>
-          <w:i/>
-          <w:color w:val="000000"/>
-          <w:sz w:val="22"/>
-          <w:szCs w:val="22"/>
-        </w:rPr>
         <w:t>Senior Data Engineer</w:t>
       </w:r>
     </w:p>
@@ -1171,11 +1154,14 @@
         <w:ind w:hanging="6" w:start="5"/>
         <w:textAlignment w:val="baseline"/>
         <w:rPr>
-          <w:color w:val="000000"/>
-        </w:rPr>
-      </w:pPr>
-      <w:r>
-        <w:rPr>
+          <w:b w:val="false"/>
+          <w:bCs w:val="false"/>
+        </w:rPr>
+      </w:pPr>
+      <w:r>
+        <w:rPr>
+          <w:b w:val="false"/>
+          <w:bCs w:val="false"/>
           <w:color w:val="000000"/>
         </w:rPr>
         <w:t>3 yrs PySpark on AWS EMR; Kinesis stream ingestion and RabbitMQ messaging feeding a JSON schema-governed event pipeline → date-partitioned Parquet in S3 → Redshift OLAP → Tableau self-service BI (filter by date, region, department, revenue, expenses); Flyway schema evolution/migrations. First engagement with legitimate Agile/Scrum practice, Jira-tracked sprints.</w:t>
@@ -1194,40 +1180,37 @@
         <w:textAlignment w:val="baseline"/>
         <w:outlineLvl w:val="3"/>
         <w:rPr>
-          <w:b/>
+          <w:b w:val="false"/>
+          <w:bCs w:val="false"/>
+        </w:rPr>
+      </w:pPr>
+      <w:r>
+        <w:rPr>
+          <w:b w:val="false"/>
+          <w:bCs w:val="false"/>
+        </w:rPr>
+        <w:t>[3] BigR.io</w:t>
+      </w:r>
+      <w:r>
+        <w:rPr>
+          <w:b w:val="false"/>
+          <w:bCs w:val="false"/>
           <w:color w:val="000000"/>
           <w:sz w:val="21"/>
           <w:szCs w:val="21"/>
         </w:rPr>
-      </w:pPr>
-      <w:r>
-        <w:rPr/>
-        <w:t>[3] BigR.io</w:t>
-      </w:r>
-    </w:p>
-    <w:p>
-      <w:pPr>
-        <w:pStyle w:val="Normal"/>
-        <w:widowControl w:val="false"/>
-        <w:spacing w:lineRule="auto" w:line="206" w:before="4" w:after="0"/>
-        <w:ind w:hanging="6" w:start="5"/>
-        <w:textAlignment w:val="baseline"/>
-        <w:rPr>
-          <w:b/>
-          <w:color w:val="000000"/>
-          <w:sz w:val="21"/>
-          <w:szCs w:val="21"/>
-        </w:rPr>
-      </w:pPr>
-      <w:r>
-        <w:rPr>
-          <w:b/>
+        <w:t xml:space="preserve"> (</w:t>
+      </w:r>
+      <w:r>
+        <w:rPr>
+          <w:b w:val="false"/>
+          <w:bCs w:val="false"/>
           <w:color w:val="000000"/>
           <w:position w:val="1"/>
           <w:sz w:val="21"/>
           <w:szCs w:val="21"/>
         </w:rPr>
-        <w:t>09/2016 – 02/2017</w:t>
+        <w:t>09/2016 – 02/2017)</w:t>
       </w:r>
     </w:p>
     <w:p>
@@ -1238,19 +1221,19 @@
         <w:ind w:hanging="6" w:start="5"/>
         <w:textAlignment w:val="baseline"/>
         <w:rPr>
+          <w:b w:val="false"/>
+          <w:bCs w:val="false"/>
+        </w:rPr>
+      </w:pPr>
+      <w:r>
+        <w:rPr>
+          <w:b w:val="false"/>
+          <w:bCs w:val="false"/>
           <w:i/>
           <w:color w:val="000000"/>
           <w:sz w:val="22"/>
           <w:szCs w:val="22"/>
         </w:rPr>
-      </w:pPr>
-      <w:r>
-        <w:rPr>
-          <w:i/>
-          <w:color w:val="000000"/>
-          <w:sz w:val="22"/>
-          <w:szCs w:val="22"/>
-        </w:rPr>
         <w:t>Senior Software Engineer</w:t>
       </w:r>
     </w:p>
@@ -1262,11 +1245,14 @@
         <w:ind w:hanging="6" w:start="5"/>
         <w:textAlignment w:val="baseline"/>
         <w:rPr>
-          <w:color w:val="000000"/>
-        </w:rPr>
-      </w:pPr>
-      <w:r>
-        <w:rPr>
+          <w:b w:val="false"/>
+          <w:bCs w:val="false"/>
+        </w:rPr>
+      </w:pPr>
+      <w:r>
+        <w:rPr>
+          <w:b w:val="false"/>
+          <w:bCs w:val="false"/>
           <w:color w:val="000000"/>
         </w:rPr>
         <w:t>Java, JSP, Spring, and PostgreSQL development.</w:t>
@@ -1285,40 +1271,37 @@
         <w:textAlignment w:val="baseline"/>
         <w:outlineLvl w:val="3"/>
         <w:rPr>
-          <w:b/>
+          <w:b w:val="false"/>
+          <w:bCs w:val="false"/>
+        </w:rPr>
+      </w:pPr>
+      <w:r>
+        <w:rPr>
+          <w:b w:val="false"/>
+          <w:bCs w:val="false"/>
+        </w:rPr>
+        <w:t>[4] ClipFile</w:t>
+      </w:r>
+      <w:r>
+        <w:rPr>
+          <w:b w:val="false"/>
+          <w:bCs w:val="false"/>
           <w:color w:val="000000"/>
           <w:sz w:val="21"/>
           <w:szCs w:val="21"/>
         </w:rPr>
-      </w:pPr>
-      <w:r>
-        <w:rPr/>
-        <w:t>[4] ClipFile</w:t>
-      </w:r>
-    </w:p>
-    <w:p>
-      <w:pPr>
-        <w:pStyle w:val="Normal"/>
-        <w:widowControl w:val="false"/>
-        <w:spacing w:lineRule="auto" w:line="206" w:before="4" w:after="0"/>
-        <w:ind w:hanging="6" w:start="5"/>
-        <w:textAlignment w:val="baseline"/>
-        <w:rPr>
-          <w:b/>
-          <w:color w:val="000000"/>
-          <w:sz w:val="21"/>
-          <w:szCs w:val="21"/>
-        </w:rPr>
-      </w:pPr>
-      <w:r>
-        <w:rPr>
-          <w:b/>
+        <w:t xml:space="preserve"> (</w:t>
+      </w:r>
+      <w:r>
+        <w:rPr>
+          <w:b w:val="false"/>
+          <w:bCs w:val="false"/>
           <w:color w:val="000000"/>
           <w:position w:val="1"/>
           <w:sz w:val="21"/>
           <w:szCs w:val="21"/>
         </w:rPr>
-        <w:t>01/2011 – 09/2016</w:t>
+        <w:t>01/2011 – 09/2016)</w:t>
       </w:r>
     </w:p>
     <w:p>
@@ -1329,19 +1312,19 @@
         <w:ind w:hanging="6" w:start="5"/>
         <w:textAlignment w:val="baseline"/>
         <w:rPr>
+          <w:b w:val="false"/>
+          <w:bCs w:val="false"/>
+        </w:rPr>
+      </w:pPr>
+      <w:r>
+        <w:rPr>
+          <w:b w:val="false"/>
+          <w:bCs w:val="false"/>
           <w:i/>
           <w:color w:val="000000"/>
           <w:sz w:val="22"/>
           <w:szCs w:val="22"/>
         </w:rPr>
-      </w:pPr>
-      <w:r>
-        <w:rPr>
-          <w:i/>
-          <w:color w:val="000000"/>
-          <w:sz w:val="22"/>
-          <w:szCs w:val="22"/>
-        </w:rPr>
         <w:t>Co-founder — AI/NLP Senior Full-Stack Engineer</w:t>
       </w:r>
     </w:p>
@@ -1353,11 +1336,14 @@
         <w:ind w:hanging="6" w:start="5"/>
         <w:textAlignment w:val="baseline"/>
         <w:rPr>
-          <w:color w:val="000000"/>
-        </w:rPr>
-      </w:pPr>
-      <w:r>
-        <w:rPr>
+          <w:b w:val="false"/>
+          <w:bCs w:val="false"/>
+        </w:rPr>
+      </w:pPr>
+      <w:r>
+        <w:rPr>
+          <w:b w:val="false"/>
+          <w:bCs w:val="false"/>
           <w:color w:val="000000"/>
         </w:rPr>
         <w:t>Built a content-curation platform (Java, Spring, DynamoDB) with large-scale content/data pipelines. Co-invented 3 NLP patents in vector-embedding recommendation systems.</w:t>
@@ -1376,40 +1362,37 @@
         <w:textAlignment w:val="baseline"/>
         <w:outlineLvl w:val="3"/>
         <w:rPr>
-          <w:b/>
+          <w:b w:val="false"/>
+          <w:bCs w:val="false"/>
+        </w:rPr>
+      </w:pPr>
+      <w:r>
+        <w:rPr>
+          <w:b w:val="false"/>
+          <w:bCs w:val="false"/>
+        </w:rPr>
+        <w:t>[5] Sierra Vista Group</w:t>
+      </w:r>
+      <w:r>
+        <w:rPr>
+          <w:b w:val="false"/>
+          <w:bCs w:val="false"/>
           <w:color w:val="000000"/>
           <w:sz w:val="21"/>
           <w:szCs w:val="21"/>
         </w:rPr>
-      </w:pPr>
-      <w:r>
-        <w:rPr/>
-        <w:t>[5] Sierra Vista Group</w:t>
-      </w:r>
-    </w:p>
-    <w:p>
-      <w:pPr>
-        <w:pStyle w:val="Normal"/>
-        <w:widowControl w:val="false"/>
-        <w:spacing w:lineRule="auto" w:line="206" w:before="4" w:after="0"/>
-        <w:ind w:hanging="6" w:start="5"/>
-        <w:textAlignment w:val="baseline"/>
-        <w:rPr>
-          <w:b/>
-          <w:color w:val="000000"/>
-          <w:sz w:val="21"/>
-          <w:szCs w:val="21"/>
-        </w:rPr>
-      </w:pPr>
-      <w:r>
-        <w:rPr>
-          <w:b/>
+        <w:t xml:space="preserve"> (</w:t>
+      </w:r>
+      <w:r>
+        <w:rPr>
+          <w:b w:val="false"/>
+          <w:bCs w:val="false"/>
           <w:color w:val="000000"/>
           <w:position w:val="1"/>
           <w:sz w:val="21"/>
           <w:szCs w:val="21"/>
         </w:rPr>
-        <w:t>12/2002 – 12/2011</w:t>
+        <w:t>12/2002 – 12/2011)</w:t>
       </w:r>
     </w:p>
     <w:p>

</xml_diff>